<commit_message>
feat: add new evaluation task and enhance metrics reporting
- Introduced a new Makefile target `hackathon-eval-big` for larger evaluation runs with updated sample sizes.
- Updated argument parsing in `run.py` to include a new `--cold-sample` parameter for flexible cold-start evaluations.
- Revised evaluation metrics in `EVAL.md` to reflect improved results from the latest evaluations, including changes in RMSE and Hit@K values.
- Updated documentation in `SUBMISSION.md` and `task_a_review_simulation.md` to accurately report the latest performance metrics and findings.
</commit_message>
<xml_diff>
--- a/hackathon/paper/task_a_review_simulation.docx
+++ b/hackathon/paper/task_a_review_simulation.docx
@@ -122,7 +122,7 @@
         <w:pStyle w:val="BodyText"/>
       </w:pPr>
       <w:r>
-        <w:t xml:space="preserve">On a real slice of the Yelp Open Dataset (five thousand users, eleven thousand food and restaurant businesses, one hundred and twelve thousand reviews, nine thousand four hundred and forty seven held out for evaluation), the agent delivers a star rating root-mean-square error of zero point nine one three. The strongest no-language-model baseline, predicting each user’s mean historical rating, scores one point two one six on the same holdout. The agent therefore reduces error by roughly twenty five percent relative to the baseline, while also producing graded review text that the baseline cannot generate. A Nigerian English voice variant, included for the localisation track, scores zero point eight nine four root-mean-square error on the same metric.</w:t>
+        <w:t xml:space="preserve">On a real slice of the Yelp Open Dataset (five thousand users, eleven thousand food and restaurant businesses, one hundred and twelve thousand reviews, nine thousand four hundred and forty seven held out for evaluation), the agent delivers a star rating root-mean-square error of zero point eight nine four. The strongest no-language-model baseline, predicting each user’s mean historical rating, scores one point one six four on the same holdout. The agent therefore reduces error by roughly twenty three percent relative to the baseline, while also producing graded review text that the baseline cannot generate. A Nigerian English voice variant, included for the localisation track, scores zero point nine eight three root-mean-square error on the same metric.</w:t>
       </w:r>
     </w:p>
     <w:bookmarkEnd w:id="10"/>
@@ -1086,6 +1086,55 @@
               <w:jc w:val="right"/>
             </w:pPr>
             <w:r>
+              <w:t xml:space="preserve">60</w:t>
+            </w:r>
+          </w:p>
+        </w:tc>
+        <w:tc>
+          <w:tcPr/>
+          <w:p>
+            <w:pPr>
+              <w:pStyle w:val="Compact"/>
+              <w:jc w:val="right"/>
+            </w:pPr>
+            <w:r>
+              <w:t xml:space="preserve">0.894</w:t>
+            </w:r>
+          </w:p>
+        </w:tc>
+        <w:tc>
+          <w:tcPr/>
+          <w:p>
+            <w:pPr>
+              <w:pStyle w:val="Compact"/>
+              <w:jc w:val="right"/>
+            </w:pPr>
+            <w:r>
+              <w:t xml:space="preserve">0.139</w:t>
+            </w:r>
+          </w:p>
+        </w:tc>
+      </w:tr>
+      <w:tr>
+        <w:tc>
+          <w:tcPr/>
+          <w:p>
+            <w:pPr>
+              <w:pStyle w:val="Compact"/>
+            </w:pPr>
+            <w:r>
+              <w:t xml:space="preserve">Nigerian English</w:t>
+            </w:r>
+          </w:p>
+        </w:tc>
+        <w:tc>
+          <w:tcPr/>
+          <w:p>
+            <w:pPr>
+              <w:pStyle w:val="Compact"/>
+              <w:jc w:val="right"/>
+            </w:pPr>
+            <w:r>
               <w:t xml:space="preserve">30</w:t>
             </w:r>
           </w:p>
@@ -1098,7 +1147,7 @@
               <w:jc w:val="right"/>
             </w:pPr>
             <w:r>
-              <w:t xml:space="preserve">0.913</w:t>
+              <w:t xml:space="preserve">0.983</w:t>
             </w:r>
           </w:p>
         </w:tc>
@@ -1110,56 +1159,7 @@
               <w:jc w:val="right"/>
             </w:pPr>
             <w:r>
-              <w:t xml:space="preserve">0.152</w:t>
-            </w:r>
-          </w:p>
-        </w:tc>
-      </w:tr>
-      <w:tr>
-        <w:tc>
-          <w:tcPr/>
-          <w:p>
-            <w:pPr>
-              <w:pStyle w:val="Compact"/>
-            </w:pPr>
-            <w:r>
-              <w:t xml:space="preserve">Nigerian English</w:t>
-            </w:r>
-          </w:p>
-        </w:tc>
-        <w:tc>
-          <w:tcPr/>
-          <w:p>
-            <w:pPr>
-              <w:pStyle w:val="Compact"/>
-              <w:jc w:val="right"/>
-            </w:pPr>
-            <w:r>
-              <w:t xml:space="preserve">15</w:t>
-            </w:r>
-          </w:p>
-        </w:tc>
-        <w:tc>
-          <w:tcPr/>
-          <w:p>
-            <w:pPr>
-              <w:pStyle w:val="Compact"/>
-              <w:jc w:val="right"/>
-            </w:pPr>
-            <w:r>
-              <w:t xml:space="preserve">0.894</w:t>
-            </w:r>
-          </w:p>
-        </w:tc>
-        <w:tc>
-          <w:tcPr/>
-          <w:p>
-            <w:pPr>
-              <w:pStyle w:val="Compact"/>
-              <w:jc w:val="right"/>
-            </w:pPr>
-            <w:r>
-              <w:t xml:space="preserve">0.129</w:t>
+              <w:t xml:space="preserve">0.130</w:t>
             </w:r>
           </w:p>
         </w:tc>
@@ -1237,7 +1237,7 @@
               <w:jc w:val="right"/>
             </w:pPr>
             <w:r>
-              <w:t xml:space="preserve">90</w:t>
+              <w:t xml:space="preserve">180</w:t>
             </w:r>
           </w:p>
         </w:tc>
@@ -1249,7 +1249,7 @@
               <w:jc w:val="right"/>
             </w:pPr>
             <w:r>
-              <w:t xml:space="preserve">1.216</w:t>
+              <w:t xml:space="preserve">1.164</w:t>
             </w:r>
           </w:p>
         </w:tc>
@@ -1260,7 +1260,7 @@
         <w:pStyle w:val="BodyText"/>
       </w:pPr>
       <w:r>
-        <w:t xml:space="preserve">The agent reduces star rating error by roughly twenty five percent against the no-language-model baseline. ROUGE-L is generally low across review simulation studies because two reviews of the same restaurant by the same person can use almost no overlapping vocabulary while still expressing the same opinion. The number we should care about is the rating error, which the agent dominates, and the qualitative review of the generated text, which is good enough that human readers cannot reliably tell the agent reviews from the held-out ones.</w:t>
+        <w:t xml:space="preserve">The agent reduces star rating error by roughly twenty three percent against the no-language-model baseline. ROUGE-L is generally low across review simulation studies because two reviews of the same restaurant by the same person can use almost no overlapping vocabulary while still expressing the same opinion. The number we should care about is the rating error, which the agent dominates, and the qualitative review of the generated text, which is good enough that human readers cannot reliably tell the agent reviews from the held-out ones.</w:t>
       </w:r>
     </w:p>
     <w:bookmarkEnd w:id="21"/>
@@ -1575,7 +1575,7 @@
         <w:pStyle w:val="BodyText"/>
       </w:pPr>
       <w:r>
-        <w:t xml:space="preserve">On a real slice of the Yelp Open Dataset, the agent reduces star rating error by roughly twenty five percent against the strongest no-language-model baseline, produces graded review text in two languages, and leaves a complete audit trail on every call. The same agent class powers the public Simulation route on entivia.online, so the artifact submitted here is a real piece of operating infrastructure, not a one-off prototype.</w:t>
+        <w:t xml:space="preserve">On a real slice of the Yelp Open Dataset, the agent reduces star rating error by roughly twenty three percent against the strongest no-language-model baseline, produces graded review text in two languages, and leaves a complete audit trail on every call. The same agent class powers the public Simulation route on entivia.online, so the artifact submitted here is a real piece of operating infrastructure, not a one-off prototype.</w:t>
       </w:r>
     </w:p>
     <w:bookmarkEnd w:id="26"/>

</xml_diff>